<commit_message>
Make name/date fields actually typeable
The rules under Name/Date were plain decorative shapes with no text
content, so there was nowhere to click and type. Add an invisible
text box over each rule so it behaves like a real form field while
keeping the same visual line underneath.

Co-Authored-By: Claude Sonnet 5 <noreply@anthropic.com>
Claude-Session: https://claude.ai/code/session_01XK5BFho7mRrng38umc9R5J
</commit_message>
<xml_diff>
--- a/cyp-formulation-clouds/CYP_Formulation_Clouds.docx
+++ b/cyp-formulation-clouds/CYP_Formulation_Clouds.docx
@@ -394,6 +394,69 @@
       </w:r>
       <w:r>
         <w:drawing>
+          <wp:anchor distT="0" distB="0" distL="0" distR="0" simplePos="0" relativeHeight="13" behindDoc="0" locked="0" layoutInCell="0" allowOverlap="1">
+            <wp:simplePos x="0" y="0"/>
+            <wp:positionH relativeFrom="page">
+              <wp:posOffset>12033504</wp:posOffset>
+            </wp:positionH>
+            <wp:positionV relativeFrom="page">
+              <wp:posOffset>557784</wp:posOffset>
+            </wp:positionV>
+            <wp:extent cx="2505456" cy="274320"/>
+            <wp:effectExtent l="0" t="0" r="0" b="0"/>
+            <wp:wrapNone/>
+            <wp:docPr id="108" name="Name field"/>
+            <wp:cNvGraphicFramePr/>
+            <a:graphic xmlns:a="http://schemas.openxmlformats.org/drawingml/2006/main">
+              <a:graphicData uri="http://schemas.microsoft.com/office/word/2010/wordprocessingShape">
+                <wps:wsp>
+                  <wps:cNvSpPr txBox="0"/>
+                  <wps:spPr bwMode="auto">
+                    <a:xfrm>
+                      <a:off x="0" y="0"/>
+                      <a:ext cx="2505456" cy="274320"/>
+                    </a:xfrm>
+                    <a:prstGeom prst="rect">
+                      <a:avLst/>
+                    </a:prstGeom>
+                    <a:noFill/>
+                    <a:ln>
+                      <a:noFill/>
+                    </a:ln>
+                  </wps:spPr>
+                  <wps:txbx>
+                    <w:txbxContent>
+                      <w:p>
+                        <w:pPr>
+                          <w:spacing w:before="0" w:after="0"/>
+                          <w:jc w:val="left"/>
+                        </w:pPr>
+                        <w:r>
+                          <w:rPr>
+                            <w:rFonts w:ascii="Trebuchet MS" w:hAnsi="Trebuchet MS" w:cs="Trebuchet MS"/>
+                            <w:color w:val="3A4451"/>
+                            <w:sz w:val="24"/>
+                            <w:szCs w:val="24"/>
+                          </w:rPr>
+                          <w:t xml:space="preserve"/>
+                        </w:r>
+                      </w:p>
+                    </w:txbxContent>
+                  </wps:txbx>
+                  <wps:bodyPr rot="0" spcFirstLastPara="0" vertOverflow="overflow" horzOverflow="overflow" vert="horz" wrap="square" lIns="36576" tIns="0" rIns="36576" bIns="18288" numCol="1" spcCol="0" rtlCol="0" fromWordArt="0" anchor="b" anchorCtr="0" forceAA="0" compatLnSpc="1">
+                    <a:prstTxWarp prst="textNoShape">
+                      <a:avLst/>
+                    </a:prstTxWarp>
+                    <a:noAutofit/>
+                  </wps:bodyPr>
+                </wps:wsp>
+              </a:graphicData>
+            </a:graphic>
+          </wp:anchor>
+        </w:drawing>
+      </w:r>
+      <w:r>
+        <w:drawing>
           <wp:anchor distT="0" distB="0" distL="0" distR="0" simplePos="0" relativeHeight="10" behindDoc="0" locked="0" layoutInCell="0" allowOverlap="1">
             <wp:simplePos x="0" y="0"/>
             <wp:positionH relativeFrom="page">
@@ -405,7 +468,7 @@
             <wp:extent cx="566928" cy="237744"/>
             <wp:effectExtent l="0" t="0" r="0" b="0"/>
             <wp:wrapNone/>
-            <wp:docPr id="108" name="Date label"/>
+            <wp:docPr id="109" name="Date label"/>
             <wp:cNvGraphicFramePr/>
             <a:graphic xmlns:a="http://schemas.openxmlformats.org/drawingml/2006/main">
               <a:graphicData uri="http://schemas.microsoft.com/office/word/2010/wordprocessingShape">
@@ -470,7 +533,7 @@
             <wp:extent cx="2505456" cy="12802"/>
             <wp:effectExtent l="0" t="0" r="0" b="0"/>
             <wp:wrapNone/>
-            <wp:docPr id="109" name="Date rule"/>
+            <wp:docPr id="110" name="Date rule"/>
             <wp:cNvGraphicFramePr/>
             <a:graphic xmlns:a="http://schemas.openxmlformats.org/drawingml/2006/main">
               <a:graphicData uri="http://schemas.microsoft.com/office/word/2010/wordprocessingShape">
@@ -505,6 +568,69 @@
       </w:r>
       <w:r>
         <w:drawing>
+          <wp:anchor distT="0" distB="0" distL="0" distR="0" simplePos="0" relativeHeight="14" behindDoc="0" locked="0" layoutInCell="0" allowOverlap="1">
+            <wp:simplePos x="0" y="0"/>
+            <wp:positionH relativeFrom="page">
+              <wp:posOffset>12033504</wp:posOffset>
+            </wp:positionH>
+            <wp:positionV relativeFrom="page">
+              <wp:posOffset>886968</wp:posOffset>
+            </wp:positionV>
+            <wp:extent cx="2505456" cy="274320"/>
+            <wp:effectExtent l="0" t="0" r="0" b="0"/>
+            <wp:wrapNone/>
+            <wp:docPr id="111" name="Date field"/>
+            <wp:cNvGraphicFramePr/>
+            <a:graphic xmlns:a="http://schemas.openxmlformats.org/drawingml/2006/main">
+              <a:graphicData uri="http://schemas.microsoft.com/office/word/2010/wordprocessingShape">
+                <wps:wsp>
+                  <wps:cNvSpPr txBox="0"/>
+                  <wps:spPr bwMode="auto">
+                    <a:xfrm>
+                      <a:off x="0" y="0"/>
+                      <a:ext cx="2505456" cy="274320"/>
+                    </a:xfrm>
+                    <a:prstGeom prst="rect">
+                      <a:avLst/>
+                    </a:prstGeom>
+                    <a:noFill/>
+                    <a:ln>
+                      <a:noFill/>
+                    </a:ln>
+                  </wps:spPr>
+                  <wps:txbx>
+                    <w:txbxContent>
+                      <w:p>
+                        <w:pPr>
+                          <w:spacing w:before="0" w:after="0"/>
+                          <w:jc w:val="left"/>
+                        </w:pPr>
+                        <w:r>
+                          <w:rPr>
+                            <w:rFonts w:ascii="Trebuchet MS" w:hAnsi="Trebuchet MS" w:cs="Trebuchet MS"/>
+                            <w:color w:val="3A4451"/>
+                            <w:sz w:val="24"/>
+                            <w:szCs w:val="24"/>
+                          </w:rPr>
+                          <w:t xml:space="preserve"/>
+                        </w:r>
+                      </w:p>
+                    </w:txbxContent>
+                  </wps:txbx>
+                  <wps:bodyPr rot="0" spcFirstLastPara="0" vertOverflow="overflow" horzOverflow="overflow" vert="horz" wrap="square" lIns="36576" tIns="0" rIns="36576" bIns="18288" numCol="1" spcCol="0" rtlCol="0" fromWordArt="0" anchor="b" anchorCtr="0" forceAA="0" compatLnSpc="1">
+                    <a:prstTxWarp prst="textNoShape">
+                      <a:avLst/>
+                    </a:prstTxWarp>
+                    <a:noAutofit/>
+                  </wps:bodyPr>
+                </wps:wsp>
+              </a:graphicData>
+            </a:graphic>
+          </wp:anchor>
+        </w:drawing>
+      </w:r>
+      <w:r>
+        <w:drawing>
           <wp:anchor distT="0" distB="0" distL="0" distR="0" simplePos="0" relativeHeight="3" behindDoc="0" locked="0" layoutInCell="0" allowOverlap="1">
             <wp:simplePos x="0" y="0"/>
             <wp:positionH relativeFrom="page">
@@ -516,7 +642,7 @@
             <wp:extent cx="14356080" cy="27432"/>
             <wp:effectExtent l="0" t="0" r="0" b="0"/>
             <wp:wrapNone/>
-            <wp:docPr id="110" name="Divider"/>
+            <wp:docPr id="112" name="Divider"/>
             <wp:cNvGraphicFramePr/>
             <a:graphic xmlns:a="http://schemas.openxmlformats.org/drawingml/2006/main">
               <a:graphicData uri="http://schemas.microsoft.com/office/word/2010/wordprocessingShape">
@@ -562,7 +688,7 @@
             <wp:extent cx="4526280" cy="3931920"/>
             <wp:effectExtent l="0" t="0" r="0" b="0"/>
             <wp:wrapNone/>
-            <wp:docPr id="111" name="Cloud 1"/>
+            <wp:docPr id="113" name="Cloud 1"/>
             <wp:cNvGraphicFramePr/>
             <a:graphic xmlns:a="http://schemas.openxmlformats.org/drawingml/2006/main">
               <a:graphicData uri="http://schemas.microsoft.com/office/word/2010/wordprocessingShape">
@@ -664,7 +790,7 @@
             <wp:extent cx="493776" cy="493776"/>
             <wp:effectExtent l="0" t="0" r="0" b="0"/>
             <wp:wrapNone/>
-            <wp:docPr id="112" name="Badge 1"/>
+            <wp:docPr id="114" name="Badge 1"/>
             <wp:cNvGraphicFramePr/>
             <a:graphic xmlns:a="http://schemas.openxmlformats.org/drawingml/2006/main">
               <a:graphicData uri="http://schemas.microsoft.com/office/word/2010/wordprocessingShape">
@@ -731,7 +857,7 @@
             <wp:extent cx="4526280" cy="3931920"/>
             <wp:effectExtent l="0" t="0" r="0" b="0"/>
             <wp:wrapNone/>
-            <wp:docPr id="113" name="Cloud 2"/>
+            <wp:docPr id="115" name="Cloud 2"/>
             <wp:cNvGraphicFramePr/>
             <a:graphic xmlns:a="http://schemas.openxmlformats.org/drawingml/2006/main">
               <a:graphicData uri="http://schemas.microsoft.com/office/word/2010/wordprocessingShape">
@@ -833,7 +959,7 @@
             <wp:extent cx="493776" cy="493776"/>
             <wp:effectExtent l="0" t="0" r="0" b="0"/>
             <wp:wrapNone/>
-            <wp:docPr id="114" name="Badge 2"/>
+            <wp:docPr id="116" name="Badge 2"/>
             <wp:cNvGraphicFramePr/>
             <a:graphic xmlns:a="http://schemas.openxmlformats.org/drawingml/2006/main">
               <a:graphicData uri="http://schemas.microsoft.com/office/word/2010/wordprocessingShape">
@@ -900,7 +1026,7 @@
             <wp:extent cx="4526280" cy="3931920"/>
             <wp:effectExtent l="0" t="0" r="0" b="0"/>
             <wp:wrapNone/>
-            <wp:docPr id="115" name="Cloud 3"/>
+            <wp:docPr id="117" name="Cloud 3"/>
             <wp:cNvGraphicFramePr/>
             <a:graphic xmlns:a="http://schemas.openxmlformats.org/drawingml/2006/main">
               <a:graphicData uri="http://schemas.microsoft.com/office/word/2010/wordprocessingShape">
@@ -1002,7 +1128,7 @@
             <wp:extent cx="493776" cy="493776"/>
             <wp:effectExtent l="0" t="0" r="0" b="0"/>
             <wp:wrapNone/>
-            <wp:docPr id="116" name="Badge 3"/>
+            <wp:docPr id="118" name="Badge 3"/>
             <wp:cNvGraphicFramePr/>
             <a:graphic xmlns:a="http://schemas.openxmlformats.org/drawingml/2006/main">
               <a:graphicData uri="http://schemas.microsoft.com/office/word/2010/wordprocessingShape">
@@ -1069,7 +1195,7 @@
             <wp:extent cx="6903720" cy="4370832"/>
             <wp:effectExtent l="0" t="0" r="0" b="0"/>
             <wp:wrapNone/>
-            <wp:docPr id="117" name="Cloud 4"/>
+            <wp:docPr id="119" name="Cloud 4"/>
             <wp:cNvGraphicFramePr/>
             <a:graphic xmlns:a="http://schemas.openxmlformats.org/drawingml/2006/main">
               <a:graphicData uri="http://schemas.microsoft.com/office/word/2010/wordprocessingShape">
@@ -1171,7 +1297,7 @@
             <wp:extent cx="493776" cy="493776"/>
             <wp:effectExtent l="0" t="0" r="0" b="0"/>
             <wp:wrapNone/>
-            <wp:docPr id="118" name="Badge 4"/>
+            <wp:docPr id="120" name="Badge 4"/>
             <wp:cNvGraphicFramePr/>
             <a:graphic xmlns:a="http://schemas.openxmlformats.org/drawingml/2006/main">
               <a:graphicData uri="http://schemas.microsoft.com/office/word/2010/wordprocessingShape">
@@ -1238,7 +1364,7 @@
             <wp:extent cx="6903720" cy="4370832"/>
             <wp:effectExtent l="0" t="0" r="0" b="0"/>
             <wp:wrapNone/>
-            <wp:docPr id="119" name="Cloud 5"/>
+            <wp:docPr id="121" name="Cloud 5"/>
             <wp:cNvGraphicFramePr/>
             <a:graphic xmlns:a="http://schemas.openxmlformats.org/drawingml/2006/main">
               <a:graphicData uri="http://schemas.microsoft.com/office/word/2010/wordprocessingShape">
@@ -1340,7 +1466,7 @@
             <wp:extent cx="493776" cy="493776"/>
             <wp:effectExtent l="0" t="0" r="0" b="0"/>
             <wp:wrapNone/>
-            <wp:docPr id="120" name="Badge 5"/>
+            <wp:docPr id="122" name="Badge 5"/>
             <wp:cNvGraphicFramePr/>
             <a:graphic xmlns:a="http://schemas.openxmlformats.org/drawingml/2006/main">
               <a:graphicData uri="http://schemas.microsoft.com/office/word/2010/wordprocessingShape">
@@ -1407,7 +1533,7 @@
             <wp:extent cx="7315200" cy="274320"/>
             <wp:effectExtent l="0" t="0" r="0" b="0"/>
             <wp:wrapNone/>
-            <wp:docPr id="121" name="Footer"/>
+            <wp:docPr id="123" name="Footer"/>
             <wp:cNvGraphicFramePr/>
             <a:graphic xmlns:a="http://schemas.openxmlformats.org/drawingml/2006/main">
               <a:graphicData uri="http://schemas.microsoft.com/office/word/2010/wordprocessingShape">

</xml_diff>